<commit_message>
added accenture innovation hub presentation
</commit_message>
<xml_diff>
--- a/BesmelhAlshaalan_Resume.docx
+++ b/BesmelhAlshaalan_Resume.docx
@@ -240,14 +240,6 @@
           <w:sz w:val="20"/>
           <w:szCs w:val="20"/>
         </w:rPr>
-        <w:t>resume</w:t>
-      </w:r>
-      <w:r>
-        <w:rPr>
-          <w:rFonts w:ascii="Cambria" w:eastAsia="Times New Roman" w:hAnsi="Cambria" w:cs="Times New Roman"/>
-          <w:sz w:val="20"/>
-          <w:szCs w:val="20"/>
-        </w:rPr>
         <w:t xml:space="preserve"> </w:t>
       </w:r>
     </w:p>
@@ -1426,22 +1418,6 @@
     </w:p>
     <w:p>
       <w:pPr>
-        <w:tabs>
-          <w:tab w:val="left" w:pos="8300"/>
-        </w:tabs>
-        <w:spacing w:after="0" w:line="240" w:lineRule="auto"/>
-        <w:ind w:right="-20"/>
-        <w:rPr>
-          <w:rFonts w:ascii="Cambria" w:eastAsia="Times New Roman" w:hAnsi="Cambria" w:cs="Times New Roman"/>
-          <w:i/>
-          <w:iCs/>
-          <w:sz w:val="10"/>
-          <w:szCs w:val="10"/>
-        </w:rPr>
-      </w:pPr>
-    </w:p>
-    <w:p>
-      <w:pPr>
         <w:pBdr>
           <w:bottom w:val="single" w:sz="12" w:space="1" w:color="auto"/>
         </w:pBdr>
@@ -1452,8 +1428,8 @@
           <w:b/>
           <w:bCs/>
           <w:noProof/>
-          <w:sz w:val="4"/>
-          <w:szCs w:val="4"/>
+          <w:sz w:val="10"/>
+          <w:szCs w:val="10"/>
         </w:rPr>
       </w:pPr>
     </w:p>
@@ -1635,6 +1611,17 @@
           <w:sz w:val="19"/>
           <w:szCs w:val="19"/>
         </w:rPr>
+        <w:t xml:space="preserve">              </w:t>
+      </w:r>
+      <w:r>
+        <w:rPr>
+          <w:rFonts w:ascii="Cambria" w:eastAsia="Times New Roman" w:hAnsi="Cambria" w:cs="Times New Roman"/>
+          <w:b/>
+          <w:bCs/>
+          <w:spacing w:val="-1"/>
+          <w:sz w:val="19"/>
+          <w:szCs w:val="19"/>
+        </w:rPr>
         <w:t>J</w:t>
       </w:r>
       <w:r>
@@ -1777,191 +1764,6 @@
     </w:p>
     <w:p>
       <w:pPr>
-        <w:tabs>
-          <w:tab w:val="left" w:pos="8240"/>
-        </w:tabs>
-        <w:spacing w:before="34" w:after="0" w:line="240" w:lineRule="auto"/>
-        <w:ind w:right="-20"/>
-        <w:rPr>
-          <w:rFonts w:ascii="Cambria" w:eastAsia="Times New Roman" w:hAnsi="Cambria" w:cs="Times New Roman"/>
-          <w:iCs/>
-          <w:sz w:val="19"/>
-          <w:szCs w:val="19"/>
-        </w:rPr>
-      </w:pPr>
-      <w:r>
-        <w:rPr>
-          <w:rFonts w:ascii="Cambria" w:eastAsia="Times New Roman" w:hAnsi="Cambria" w:cs="Times New Roman"/>
-          <w:b/>
-          <w:bCs/>
-          <w:iCs/>
-          <w:spacing w:val="-1"/>
-          <w:sz w:val="19"/>
-          <w:szCs w:val="19"/>
-        </w:rPr>
-        <w:t>VR Game Development Intern</w:t>
-      </w:r>
-      <w:r>
-        <w:rPr>
-          <w:rFonts w:ascii="Cambria" w:eastAsia="Times New Roman" w:hAnsi="Cambria" w:cs="Times New Roman"/>
-          <w:b/>
-          <w:bCs/>
-          <w:spacing w:val="-1"/>
-          <w:sz w:val="19"/>
-          <w:szCs w:val="19"/>
-        </w:rPr>
-        <w:t xml:space="preserve">, </w:t>
-      </w:r>
-      <w:r>
-        <w:rPr>
-          <w:rFonts w:ascii="Cambria" w:eastAsia="Times New Roman" w:hAnsi="Cambria" w:cs="Times New Roman"/>
-          <w:b/>
-          <w:bCs/>
-          <w:spacing w:val="-1"/>
-          <w:sz w:val="19"/>
-          <w:szCs w:val="19"/>
-        </w:rPr>
-        <w:t>Saudi Aramco</w:t>
-      </w:r>
-      <w:r>
-        <w:rPr>
-          <w:rFonts w:ascii="Cambria" w:eastAsia="Times New Roman" w:hAnsi="Cambria" w:cs="Times New Roman"/>
-          <w:b/>
-          <w:bCs/>
-          <w:spacing w:val="-1"/>
-          <w:sz w:val="19"/>
-          <w:szCs w:val="19"/>
-        </w:rPr>
-        <w:t xml:space="preserve">, </w:t>
-      </w:r>
-      <w:r>
-        <w:rPr>
-          <w:rFonts w:ascii="Cambria" w:eastAsia="Times New Roman" w:hAnsi="Cambria" w:cs="Times New Roman"/>
-          <w:i/>
-          <w:iCs/>
-          <w:spacing w:val="-1"/>
-          <w:sz w:val="19"/>
-          <w:szCs w:val="19"/>
-        </w:rPr>
-        <w:t>Dhahran</w:t>
-      </w:r>
-      <w:r>
-        <w:rPr>
-          <w:rFonts w:ascii="Cambria" w:eastAsia="Times New Roman" w:hAnsi="Cambria" w:cs="Times New Roman"/>
-          <w:i/>
-          <w:iCs/>
-          <w:spacing w:val="-1"/>
-          <w:sz w:val="19"/>
-          <w:szCs w:val="19"/>
-        </w:rPr>
-        <w:t>, Saudi Arabia</w:t>
-      </w:r>
-      <w:r>
-        <w:rPr>
-          <w:rFonts w:ascii="Cambria" w:eastAsia="Times New Roman" w:hAnsi="Cambria" w:cs="Times New Roman"/>
-          <w:b/>
-          <w:bCs/>
-          <w:spacing w:val="-1"/>
-          <w:sz w:val="19"/>
-          <w:szCs w:val="19"/>
-        </w:rPr>
-        <w:t xml:space="preserve">                                   </w:t>
-      </w:r>
-      <w:r>
-        <w:rPr>
-          <w:rFonts w:ascii="Cambria" w:eastAsia="Times New Roman" w:hAnsi="Cambria" w:cs="Times New Roman"/>
-          <w:b/>
-          <w:bCs/>
-          <w:spacing w:val="-1"/>
-          <w:sz w:val="19"/>
-          <w:szCs w:val="19"/>
-        </w:rPr>
-        <w:t xml:space="preserve">                                              </w:t>
-      </w:r>
-      <w:r>
-        <w:rPr>
-          <w:rFonts w:ascii="Cambria" w:eastAsia="Times New Roman" w:hAnsi="Cambria" w:cs="Times New Roman"/>
-          <w:b/>
-          <w:bCs/>
-          <w:spacing w:val="-1"/>
-          <w:sz w:val="19"/>
-          <w:szCs w:val="19"/>
-        </w:rPr>
-        <w:t xml:space="preserve">    </w:t>
-      </w:r>
-      <w:r>
-        <w:rPr>
-          <w:rFonts w:ascii="Cambria" w:eastAsia="Times New Roman" w:hAnsi="Cambria" w:cs="Times New Roman"/>
-          <w:b/>
-          <w:bCs/>
-          <w:sz w:val="19"/>
-          <w:szCs w:val="19"/>
-        </w:rPr>
-        <w:t>June</w:t>
-      </w:r>
-      <w:r>
-        <w:rPr>
-          <w:rFonts w:ascii="Cambria" w:eastAsia="Times New Roman" w:hAnsi="Cambria" w:cs="Times New Roman"/>
-          <w:b/>
-          <w:bCs/>
-          <w:sz w:val="19"/>
-          <w:szCs w:val="19"/>
-        </w:rPr>
-        <w:t xml:space="preserve"> 202</w:t>
-      </w:r>
-      <w:r>
-        <w:rPr>
-          <w:rFonts w:ascii="Cambria" w:eastAsia="Times New Roman" w:hAnsi="Cambria" w:cs="Times New Roman"/>
-          <w:b/>
-          <w:bCs/>
-          <w:sz w:val="19"/>
-          <w:szCs w:val="19"/>
-        </w:rPr>
-        <w:t>4</w:t>
-      </w:r>
-      <w:r>
-        <w:rPr>
-          <w:rFonts w:ascii="Cambria" w:eastAsia="Times New Roman" w:hAnsi="Cambria" w:cs="Times New Roman"/>
-          <w:b/>
-          <w:bCs/>
-          <w:sz w:val="19"/>
-          <w:szCs w:val="19"/>
-        </w:rPr>
-        <w:t xml:space="preserve"> – </w:t>
-      </w:r>
-      <w:r>
-        <w:rPr>
-          <w:rFonts w:ascii="Cambria" w:eastAsia="Times New Roman" w:hAnsi="Cambria" w:cs="Times New Roman"/>
-          <w:b/>
-          <w:bCs/>
-          <w:sz w:val="19"/>
-          <w:szCs w:val="19"/>
-        </w:rPr>
-        <w:t>Aug</w:t>
-      </w:r>
-      <w:r>
-        <w:rPr>
-          <w:rFonts w:ascii="Cambria" w:eastAsia="Times New Roman" w:hAnsi="Cambria" w:cs="Times New Roman"/>
-          <w:b/>
-          <w:bCs/>
-          <w:sz w:val="19"/>
-          <w:szCs w:val="19"/>
-        </w:rPr>
-        <w:t xml:space="preserve"> 202</w:t>
-      </w:r>
-      <w:r>
-        <w:rPr>
-          <w:rFonts w:ascii="Cambria" w:eastAsia="Times New Roman" w:hAnsi="Cambria" w:cs="Times New Roman"/>
-          <w:b/>
-          <w:bCs/>
-          <w:sz w:val="19"/>
-          <w:szCs w:val="19"/>
-        </w:rPr>
-        <w:t>4</w:t>
-      </w:r>
-    </w:p>
-    <w:p>
-      <w:pPr>
         <w:pStyle w:val="ListParagraph"/>
         <w:numPr>
           <w:ilvl w:val="0"/>
@@ -1973,38 +1775,205 @@
         <w:spacing w:before="34" w:after="0"/>
         <w:ind w:right="-20"/>
         <w:rPr>
-          <w:rFonts w:ascii="Cambria" w:eastAsia="Times New Roman" w:hAnsi="Cambria" w:cs="Times New Roman"/>
-          <w:iCs/>
-          <w:sz w:val="19"/>
-          <w:szCs w:val="19"/>
-        </w:rPr>
-      </w:pPr>
-      <w:r>
-        <w:rPr>
-          <w:rFonts w:ascii="Cambria" w:eastAsia="Times New Roman" w:hAnsi="Cambria" w:cs="Times New Roman"/>
-          <w:iCs/>
-          <w:sz w:val="19"/>
-          <w:szCs w:val="19"/>
-        </w:rPr>
-        <w:t xml:space="preserve">Conceptualized and prototyped educational oil exploration game using Figma, completing </w:t>
-      </w:r>
-      <w:r>
-        <w:rPr>
-          <w:rFonts w:ascii="Cambria" w:eastAsia="Times New Roman" w:hAnsi="Cambria" w:cs="Times New Roman"/>
-          <w:iCs/>
-          <w:sz w:val="19"/>
-          <w:szCs w:val="19"/>
-        </w:rPr>
-        <w:t>~</w:t>
-      </w:r>
-      <w:r>
-        <w:rPr>
-          <w:rFonts w:ascii="Cambria" w:eastAsia="Times New Roman" w:hAnsi="Cambria" w:cs="Times New Roman"/>
-          <w:iCs/>
-          <w:sz w:val="19"/>
-          <w:szCs w:val="19"/>
-        </w:rPr>
-        <w:t>30% of game development process.</w:t>
+          <w:rFonts w:ascii="Cambria" w:eastAsia="Times New Roman" w:hAnsi="Cambria"/>
+          <w:iCs/>
+          <w:sz w:val="19"/>
+          <w:szCs w:val="19"/>
+        </w:rPr>
+      </w:pPr>
+      <w:r>
+        <w:rPr>
+          <w:rFonts w:ascii="Cambria" w:eastAsia="Times New Roman" w:hAnsi="Cambria"/>
+          <w:iCs/>
+          <w:sz w:val="19"/>
+          <w:szCs w:val="19"/>
+        </w:rPr>
+        <w:t>Led user research and design, presenting a winning youth-first travel experience solution at Accenture’s Innovation Hub challenge.</w:t>
+      </w:r>
+    </w:p>
+    <w:p>
+      <w:pPr>
+        <w:tabs>
+          <w:tab w:val="left" w:pos="8240"/>
+        </w:tabs>
+        <w:spacing w:before="34" w:after="0" w:line="240" w:lineRule="auto"/>
+        <w:ind w:right="-20"/>
+        <w:rPr>
+          <w:rFonts w:ascii="Cambria" w:eastAsia="Times New Roman" w:hAnsi="Cambria" w:cs="Times New Roman"/>
+          <w:iCs/>
+          <w:sz w:val="19"/>
+          <w:szCs w:val="19"/>
+        </w:rPr>
+      </w:pPr>
+      <w:r>
+        <w:rPr>
+          <w:rFonts w:ascii="Cambria" w:eastAsia="Times New Roman" w:hAnsi="Cambria" w:cs="Times New Roman"/>
+          <w:b/>
+          <w:bCs/>
+          <w:iCs/>
+          <w:spacing w:val="-1"/>
+          <w:sz w:val="19"/>
+          <w:szCs w:val="19"/>
+        </w:rPr>
+        <w:t>VR Game Development Intern</w:t>
+      </w:r>
+      <w:r>
+        <w:rPr>
+          <w:rFonts w:ascii="Cambria" w:eastAsia="Times New Roman" w:hAnsi="Cambria" w:cs="Times New Roman"/>
+          <w:b/>
+          <w:bCs/>
+          <w:spacing w:val="-1"/>
+          <w:sz w:val="19"/>
+          <w:szCs w:val="19"/>
+        </w:rPr>
+        <w:t xml:space="preserve">, </w:t>
+      </w:r>
+      <w:r>
+        <w:rPr>
+          <w:rFonts w:ascii="Cambria" w:eastAsia="Times New Roman" w:hAnsi="Cambria" w:cs="Times New Roman"/>
+          <w:b/>
+          <w:bCs/>
+          <w:spacing w:val="-1"/>
+          <w:sz w:val="19"/>
+          <w:szCs w:val="19"/>
+        </w:rPr>
+        <w:t>Saudi Aramco</w:t>
+      </w:r>
+      <w:r>
+        <w:rPr>
+          <w:rFonts w:ascii="Cambria" w:eastAsia="Times New Roman" w:hAnsi="Cambria" w:cs="Times New Roman"/>
+          <w:b/>
+          <w:bCs/>
+          <w:spacing w:val="-1"/>
+          <w:sz w:val="19"/>
+          <w:szCs w:val="19"/>
+        </w:rPr>
+        <w:t xml:space="preserve">, </w:t>
+      </w:r>
+      <w:r>
+        <w:rPr>
+          <w:rFonts w:ascii="Cambria" w:eastAsia="Times New Roman" w:hAnsi="Cambria" w:cs="Times New Roman"/>
+          <w:i/>
+          <w:iCs/>
+          <w:spacing w:val="-1"/>
+          <w:sz w:val="19"/>
+          <w:szCs w:val="19"/>
+        </w:rPr>
+        <w:t>Dhahran</w:t>
+      </w:r>
+      <w:r>
+        <w:rPr>
+          <w:rFonts w:ascii="Cambria" w:eastAsia="Times New Roman" w:hAnsi="Cambria" w:cs="Times New Roman"/>
+          <w:i/>
+          <w:iCs/>
+          <w:spacing w:val="-1"/>
+          <w:sz w:val="19"/>
+          <w:szCs w:val="19"/>
+        </w:rPr>
+        <w:t>, Saudi Arabia</w:t>
+      </w:r>
+      <w:r>
+        <w:rPr>
+          <w:rFonts w:ascii="Cambria" w:eastAsia="Times New Roman" w:hAnsi="Cambria" w:cs="Times New Roman"/>
+          <w:b/>
+          <w:bCs/>
+          <w:spacing w:val="-1"/>
+          <w:sz w:val="19"/>
+          <w:szCs w:val="19"/>
+        </w:rPr>
+        <w:t xml:space="preserve">                                   </w:t>
+      </w:r>
+      <w:r>
+        <w:rPr>
+          <w:rFonts w:ascii="Cambria" w:eastAsia="Times New Roman" w:hAnsi="Cambria" w:cs="Times New Roman"/>
+          <w:b/>
+          <w:bCs/>
+          <w:spacing w:val="-1"/>
+          <w:sz w:val="19"/>
+          <w:szCs w:val="19"/>
+        </w:rPr>
+        <w:t xml:space="preserve">                                              </w:t>
+      </w:r>
+      <w:r>
+        <w:rPr>
+          <w:rFonts w:ascii="Cambria" w:eastAsia="Times New Roman" w:hAnsi="Cambria" w:cs="Times New Roman"/>
+          <w:b/>
+          <w:bCs/>
+          <w:spacing w:val="-1"/>
+          <w:sz w:val="19"/>
+          <w:szCs w:val="19"/>
+        </w:rPr>
+        <w:t xml:space="preserve">    </w:t>
+      </w:r>
+      <w:r>
+        <w:rPr>
+          <w:rFonts w:ascii="Cambria" w:eastAsia="Times New Roman" w:hAnsi="Cambria" w:cs="Times New Roman"/>
+          <w:b/>
+          <w:bCs/>
+          <w:sz w:val="19"/>
+          <w:szCs w:val="19"/>
+        </w:rPr>
+        <w:t>June</w:t>
+      </w:r>
+      <w:r>
+        <w:rPr>
+          <w:rFonts w:ascii="Cambria" w:eastAsia="Times New Roman" w:hAnsi="Cambria" w:cs="Times New Roman"/>
+          <w:b/>
+          <w:bCs/>
+          <w:sz w:val="19"/>
+          <w:szCs w:val="19"/>
+        </w:rPr>
+        <w:t xml:space="preserve"> 202</w:t>
+      </w:r>
+      <w:r>
+        <w:rPr>
+          <w:rFonts w:ascii="Cambria" w:eastAsia="Times New Roman" w:hAnsi="Cambria" w:cs="Times New Roman"/>
+          <w:b/>
+          <w:bCs/>
+          <w:sz w:val="19"/>
+          <w:szCs w:val="19"/>
+        </w:rPr>
+        <w:t>4</w:t>
+      </w:r>
+      <w:r>
+        <w:rPr>
+          <w:rFonts w:ascii="Cambria" w:eastAsia="Times New Roman" w:hAnsi="Cambria" w:cs="Times New Roman"/>
+          <w:b/>
+          <w:bCs/>
+          <w:sz w:val="19"/>
+          <w:szCs w:val="19"/>
+        </w:rPr>
+        <w:t xml:space="preserve"> – </w:t>
+      </w:r>
+      <w:r>
+        <w:rPr>
+          <w:rFonts w:ascii="Cambria" w:eastAsia="Times New Roman" w:hAnsi="Cambria" w:cs="Times New Roman"/>
+          <w:b/>
+          <w:bCs/>
+          <w:sz w:val="19"/>
+          <w:szCs w:val="19"/>
+        </w:rPr>
+        <w:t>Aug</w:t>
+      </w:r>
+      <w:r>
+        <w:rPr>
+          <w:rFonts w:ascii="Cambria" w:eastAsia="Times New Roman" w:hAnsi="Cambria" w:cs="Times New Roman"/>
+          <w:b/>
+          <w:bCs/>
+          <w:sz w:val="19"/>
+          <w:szCs w:val="19"/>
+        </w:rPr>
+        <w:t xml:space="preserve"> 202</w:t>
+      </w:r>
+      <w:r>
+        <w:rPr>
+          <w:rFonts w:ascii="Cambria" w:eastAsia="Times New Roman" w:hAnsi="Cambria" w:cs="Times New Roman"/>
+          <w:b/>
+          <w:bCs/>
+          <w:sz w:val="19"/>
+          <w:szCs w:val="19"/>
+        </w:rPr>
+        <w:t>4</w:t>
       </w:r>
     </w:p>
     <w:p>
@@ -2017,6 +1986,53 @@
         <w:tabs>
           <w:tab w:val="left" w:pos="8240"/>
         </w:tabs>
+        <w:spacing w:before="34" w:after="0"/>
+        <w:ind w:right="-20"/>
+        <w:rPr>
+          <w:rFonts w:ascii="Cambria" w:eastAsia="Times New Roman" w:hAnsi="Cambria" w:cs="Times New Roman"/>
+          <w:iCs/>
+          <w:sz w:val="19"/>
+          <w:szCs w:val="19"/>
+        </w:rPr>
+      </w:pPr>
+      <w:r>
+        <w:rPr>
+          <w:rFonts w:ascii="Cambria" w:eastAsia="Times New Roman" w:hAnsi="Cambria" w:cs="Times New Roman"/>
+          <w:iCs/>
+          <w:sz w:val="19"/>
+          <w:szCs w:val="19"/>
+        </w:rPr>
+        <w:t xml:space="preserve">Conceptualized and prototyped educational oil exploration game using Figma, completing </w:t>
+      </w:r>
+      <w:r>
+        <w:rPr>
+          <w:rFonts w:ascii="Cambria" w:eastAsia="Times New Roman" w:hAnsi="Cambria" w:cs="Times New Roman"/>
+          <w:iCs/>
+          <w:sz w:val="19"/>
+          <w:szCs w:val="19"/>
+        </w:rPr>
+        <w:t>~</w:t>
+      </w:r>
+      <w:r>
+        <w:rPr>
+          <w:rFonts w:ascii="Cambria" w:eastAsia="Times New Roman" w:hAnsi="Cambria" w:cs="Times New Roman"/>
+          <w:iCs/>
+          <w:sz w:val="19"/>
+          <w:szCs w:val="19"/>
+        </w:rPr>
+        <w:t>30% of game development process.</w:t>
+      </w:r>
+    </w:p>
+    <w:p>
+      <w:pPr>
+        <w:pStyle w:val="ListParagraph"/>
+        <w:numPr>
+          <w:ilvl w:val="0"/>
+          <w:numId w:val="34"/>
+        </w:numPr>
+        <w:tabs>
+          <w:tab w:val="left" w:pos="8240"/>
+        </w:tabs>
         <w:spacing w:before="34" w:after="0" w:line="240" w:lineRule="auto"/>
         <w:ind w:right="-20"/>
         <w:rPr>
@@ -3440,21 +3456,6 @@
     </w:p>
     <w:p>
       <w:pPr>
-        <w:tabs>
-          <w:tab w:val="left" w:pos="8240"/>
-        </w:tabs>
-        <w:spacing w:before="34" w:after="0"/>
-        <w:ind w:right="-20"/>
-        <w:rPr>
-          <w:rFonts w:ascii="Cambria" w:eastAsia="Times New Roman" w:hAnsi="Cambria" w:cs="Times New Roman"/>
-          <w:iCs/>
-          <w:sz w:val="10"/>
-          <w:szCs w:val="10"/>
-        </w:rPr>
-      </w:pPr>
-    </w:p>
-    <w:p>
-      <w:pPr>
         <w:pBdr>
           <w:bottom w:val="single" w:sz="12" w:space="1" w:color="auto"/>
         </w:pBdr>
@@ -3465,8 +3466,8 @@
           <w:b/>
           <w:bCs/>
           <w:noProof/>
-          <w:sz w:val="4"/>
-          <w:szCs w:val="4"/>
+          <w:sz w:val="10"/>
+          <w:szCs w:val="10"/>
         </w:rPr>
       </w:pPr>
     </w:p>
@@ -3830,22 +3831,6 @@
     </w:p>
     <w:p>
       <w:pPr>
-        <w:tabs>
-          <w:tab w:val="left" w:pos="8240"/>
-          <w:tab w:val="left" w:pos="9523"/>
-        </w:tabs>
-        <w:spacing w:after="0" w:line="240" w:lineRule="auto"/>
-        <w:ind w:right="-20"/>
-        <w:rPr>
-          <w:rFonts w:ascii="Cambria" w:eastAsia="Times New Roman" w:hAnsi="Cambria" w:cs="Times New Roman"/>
-          <w:spacing w:val="1"/>
-          <w:sz w:val="10"/>
-          <w:szCs w:val="10"/>
-        </w:rPr>
-      </w:pPr>
-    </w:p>
-    <w:p>
-      <w:pPr>
         <w:pBdr>
           <w:bottom w:val="single" w:sz="12" w:space="1" w:color="auto"/>
         </w:pBdr>
@@ -3857,8 +3842,8 @@
           <w:bCs/>
           <w:spacing w:val="1"/>
           <w:position w:val="-1"/>
-          <w:sz w:val="6"/>
-          <w:szCs w:val="6"/>
+          <w:sz w:val="10"/>
+          <w:szCs w:val="10"/>
         </w:rPr>
       </w:pPr>
     </w:p>
@@ -4579,22 +4564,6 @@
           <w:spacing w:val="1"/>
           <w:sz w:val="10"/>
           <w:szCs w:val="10"/>
-        </w:rPr>
-      </w:pPr>
-    </w:p>
-    <w:p>
-      <w:pPr>
-        <w:tabs>
-          <w:tab w:val="left" w:pos="8240"/>
-          <w:tab w:val="left" w:pos="9523"/>
-        </w:tabs>
-        <w:spacing w:before="34" w:after="0" w:line="240" w:lineRule="auto"/>
-        <w:ind w:right="-20"/>
-        <w:rPr>
-          <w:rFonts w:ascii="Cambria" w:eastAsia="Times New Roman" w:hAnsi="Cambria" w:cs="Times New Roman"/>
-          <w:spacing w:val="1"/>
-          <w:sz w:val="4"/>
-          <w:szCs w:val="4"/>
         </w:rPr>
       </w:pPr>
     </w:p>

</xml_diff>